<commit_message>
Agrega informe resumido, presentacion final y guia de buenas practicas
</commit_message>
<xml_diff>
--- a/docs/Infraestructura_Viva_Informe_Resumido.docx
+++ b/docs/Infraestructura_Viva_Informe_Resumido.docx
@@ -43,77 +43,23 @@
           <w:iCs/>
           <w:color w:val="4A6B87"/>
         </w:rPr>
-        <w:t xml:space="preserve">Migración de Soluciones Digitales ACME a AWS </w:t>
-      </w:r>
-      <w:proofErr w:type="gramStart"/>
+        <w:t xml:space="preserve">Migración de Soluciones Digitales ACME a AWS Cloud  ·  Módulo 4, </w:t>
+      </w:r>
       <w:r>
         <w:rPr>
           <w:i/>
           <w:iCs/>
           <w:color w:val="4A6B87"/>
         </w:rPr>
-        <w:t>Cloud  ·</w:t>
-      </w:r>
-      <w:proofErr w:type="gramEnd"/>
+        <w:t>GRUPO 01</w:t>
+      </w:r>
       <w:r>
         <w:rPr>
           <w:i/>
           <w:iCs/>
           <w:color w:val="4A6B87"/>
         </w:rPr>
-        <w:t xml:space="preserve">  Módulo 4, </w:t>
-      </w:r>
-      <w:r>
-        <w:rPr>
-          <w:i/>
-          <w:iCs/>
-          <w:color w:val="4A6B87"/>
-        </w:rPr>
-        <w:t xml:space="preserve">GRUPO </w:t>
-      </w:r>
-      <w:proofErr w:type="gramStart"/>
-      <w:r>
-        <w:rPr>
-          <w:i/>
-          <w:iCs/>
-          <w:color w:val="4A6B87"/>
-        </w:rPr>
-        <w:t>01</w:t>
-      </w:r>
-      <w:r>
-        <w:rPr>
-          <w:i/>
-          <w:iCs/>
-          <w:color w:val="4A6B87"/>
-        </w:rPr>
-        <w:t xml:space="preserve">  ·</w:t>
-      </w:r>
-      <w:proofErr w:type="gramEnd"/>
-      <w:r>
-        <w:rPr>
-          <w:i/>
-          <w:iCs/>
-          <w:color w:val="4A6B87"/>
-        </w:rPr>
-        <w:t xml:space="preserve">  </w:t>
-      </w:r>
-      <w:proofErr w:type="gramStart"/>
-      <w:r>
-        <w:rPr>
-          <w:i/>
-          <w:iCs/>
-          <w:color w:val="4A6B87"/>
-        </w:rPr>
-        <w:t>Junio</w:t>
-      </w:r>
-      <w:proofErr w:type="gramEnd"/>
-      <w:r>
-        <w:rPr>
-          <w:i/>
-          <w:iCs/>
-          <w:color w:val="4A6B87"/>
-        </w:rPr>
-        <w:t xml:space="preserve"> 2026</w:t>
+        <w:t xml:space="preserve">  ·  Junio 2026</w:t>
       </w:r>
     </w:p>
     <w:p>
@@ -137,31 +83,7 @@
         <w:spacing w:after="140" w:line="290" w:lineRule="auto"/>
       </w:pPr>
       <w:r>
-        <w:t xml:space="preserve">Soluciones Digitales ACME opera hoy sobre un entorno </w:t>
-      </w:r>
-      <w:proofErr w:type="spellStart"/>
-      <w:r>
-        <w:t>on</w:t>
-      </w:r>
-      <w:proofErr w:type="spellEnd"/>
-      <w:r>
-        <w:t xml:space="preserve">-premise que genera altos costos de mantenimiento y limita la rápida implementación de nuevas funcionalidades para ventas, soporte y finanzas. “Infraestructura Viva” propone migrar ese entorno a AWS usando únicamente herramientas gratuitas (AWS Free Tier, AWS </w:t>
-      </w:r>
-      <w:proofErr w:type="spellStart"/>
-      <w:r>
-        <w:t>Academy</w:t>
-      </w:r>
-      <w:proofErr w:type="spellEnd"/>
-      <w:r>
-        <w:t xml:space="preserve">, </w:t>
-      </w:r>
-      <w:proofErr w:type="spellStart"/>
-      <w:r>
-        <w:t>SQLiteOnline</w:t>
-      </w:r>
-      <w:proofErr w:type="spellEnd"/>
-      <w:r>
-        <w:t xml:space="preserve"> y Visual Studio Code), resolviendo seis problemáticas: cómputo escalable, integración de bases de datos relacionales y NoSQL, almacenamiento diferenciado por frecuencia de uso, red segmentada, monitoreo proactivo y viabilidad de implementación con los contenidos del módulo.</w:t>
+        <w:t>Soluciones Digitales ACME opera hoy sobre un entorno on-premise que genera altos costos de mantenimiento y limita la rápida implementación de nuevas funcionalidades para ventas, soporte y finanzas. “Infraestructura Viva” propone migrar ese entorno a AWS usando únicamente herramientas gratuitas (AWS Free Tier, AWS Academy, SQLiteOnline y Visual Studio Code), resolviendo seis problemáticas: cómputo escalable, integración de bases de datos relacionales y NoSQL, almacenamiento diferenciado por frecuencia de uso, red segmentada, monitoreo proactivo y viabilidad de implementación con los contenidos del módulo.</w:t>
       </w:r>
     </w:p>
     <w:p>
@@ -177,47 +99,7 @@
         <w:spacing w:after="140" w:line="290" w:lineRule="auto"/>
       </w:pPr>
       <w:r>
-        <w:t xml:space="preserve">La solución se organiza en una VPC con subredes públicas y privadas: capa de entrada (Route 53, </w:t>
-      </w:r>
-      <w:proofErr w:type="spellStart"/>
-      <w:r>
-        <w:t>CloudFront</w:t>
-      </w:r>
-      <w:proofErr w:type="spellEnd"/>
-      <w:r>
-        <w:t xml:space="preserve">, ALB), capa de cómputo (EC2 con Auto </w:t>
-      </w:r>
-      <w:proofErr w:type="spellStart"/>
-      <w:r>
-        <w:t>Scaling</w:t>
-      </w:r>
-      <w:proofErr w:type="spellEnd"/>
-      <w:r>
-        <w:t>, Lambda, ECS/</w:t>
-      </w:r>
-      <w:proofErr w:type="spellStart"/>
-      <w:r>
-        <w:t>Fargate</w:t>
-      </w:r>
-      <w:proofErr w:type="spellEnd"/>
-      <w:r>
-        <w:t xml:space="preserve">), capa de datos (RDS PostgreSQL y </w:t>
-      </w:r>
-      <w:proofErr w:type="spellStart"/>
-      <w:r>
-        <w:t>DynamoDB</w:t>
-      </w:r>
-      <w:proofErr w:type="spellEnd"/>
-      <w:r>
-        <w:t>), almacenamiento (S3 Estándar y Glacier) y una capa transversal de monitoreo y mensajería (</w:t>
-      </w:r>
-      <w:proofErr w:type="spellStart"/>
-      <w:r>
-        <w:t>CloudWatch</w:t>
-      </w:r>
-      <w:proofErr w:type="spellEnd"/>
-      <w:r>
-        <w:t>, SNS, SQS). El diagrama completo y la justificación de cada componente están en el Documento de Arquitectura.</w:t>
+        <w:t>La solución se organiza en una VPC con subredes públicas y privadas: capa de entrada (Route 53, CloudFront, ALB), capa de cómputo (EC2 con Auto Scaling, Lambda, ECS/Fargate), capa de datos (RDS PostgreSQL y DynamoDB), almacenamiento (S3 Estándar y Glacier) y una capa transversal de monitoreo y mensajería (CloudWatch, SNS, SQS). El diagrama completo y la justificación de cada componente están en el Documento de Arquitectura.</w:t>
       </w:r>
     </w:p>
     <w:tbl>
@@ -243,12 +125,6 @@
         <w:gridCol w:w="4560"/>
       </w:tblGrid>
       <w:tr>
-        <w:tblPrEx>
-          <w:tblCellMar>
-            <w:top w:w="0" w:type="dxa"/>
-            <w:bottom w:w="0" w:type="dxa"/>
-          </w:tblCellMar>
-        </w:tblPrEx>
         <w:tc>
           <w:tcPr>
             <w:tcW w:w="1800" w:type="dxa"/>
@@ -344,12 +220,6 @@
         </w:tc>
       </w:tr>
       <w:tr>
-        <w:tblPrEx>
-          <w:tblCellMar>
-            <w:top w:w="0" w:type="dxa"/>
-            <w:bottom w:w="0" w:type="dxa"/>
-          </w:tblCellMar>
-        </w:tblPrEx>
         <w:tc>
           <w:tcPr>
             <w:tcW w:w="1800" w:type="dxa"/>
@@ -400,23 +270,7 @@
                 <w:sz w:val="18"/>
                 <w:szCs w:val="18"/>
               </w:rPr>
-              <w:t xml:space="preserve">EC2 + Auto </w:t>
-            </w:r>
-            <w:proofErr w:type="spellStart"/>
-            <w:r>
-              <w:rPr>
-                <w:sz w:val="18"/>
-                <w:szCs w:val="18"/>
-              </w:rPr>
-              <w:t>Scaling</w:t>
-            </w:r>
-            <w:proofErr w:type="spellEnd"/>
-            <w:r>
-              <w:rPr>
-                <w:sz w:val="18"/>
-                <w:szCs w:val="18"/>
-              </w:rPr>
-              <w:t>, Lambda, ECS</w:t>
+              <w:t>EC2 + Auto Scaling, Lambda, ECS</w:t>
             </w:r>
           </w:p>
         </w:tc>
@@ -449,12 +303,6 @@
         </w:tc>
       </w:tr>
       <w:tr>
-        <w:tblPrEx>
-          <w:tblCellMar>
-            <w:top w:w="0" w:type="dxa"/>
-            <w:bottom w:w="0" w:type="dxa"/>
-          </w:tblCellMar>
-        </w:tblPrEx>
         <w:tc>
           <w:tcPr>
             <w:tcW w:w="1800" w:type="dxa"/>
@@ -507,17 +355,8 @@
                 <w:sz w:val="18"/>
                 <w:szCs w:val="18"/>
               </w:rPr>
-              <w:t xml:space="preserve">RDS PostgreSQL, </w:t>
-            </w:r>
-            <w:proofErr w:type="spellStart"/>
-            <w:r>
-              <w:rPr>
-                <w:sz w:val="18"/>
-                <w:szCs w:val="18"/>
-              </w:rPr>
-              <w:t>DynamoDB</w:t>
-            </w:r>
-            <w:proofErr w:type="spellEnd"/>
+              <w:t>RDS PostgreSQL, DynamoDB</w:t>
+            </w:r>
           </w:p>
         </w:tc>
         <w:tc>
@@ -550,12 +389,6 @@
         </w:tc>
       </w:tr>
       <w:tr>
-        <w:tblPrEx>
-          <w:tblCellMar>
-            <w:top w:w="0" w:type="dxa"/>
-            <w:bottom w:w="0" w:type="dxa"/>
-          </w:tblCellMar>
-        </w:tblPrEx>
         <w:tc>
           <w:tcPr>
             <w:tcW w:w="1800" w:type="dxa"/>
@@ -639,12 +472,6 @@
         </w:tc>
       </w:tr>
       <w:tr>
-        <w:tblPrEx>
-          <w:tblCellMar>
-            <w:top w:w="0" w:type="dxa"/>
-            <w:bottom w:w="0" w:type="dxa"/>
-          </w:tblCellMar>
-        </w:tblPrEx>
         <w:tc>
           <w:tcPr>
             <w:tcW w:w="1800" w:type="dxa"/>
@@ -697,17 +524,8 @@
                 <w:sz w:val="18"/>
                 <w:szCs w:val="18"/>
               </w:rPr>
-              <w:t xml:space="preserve">VPC, ALB, Security </w:t>
-            </w:r>
-            <w:proofErr w:type="spellStart"/>
-            <w:r>
-              <w:rPr>
-                <w:sz w:val="18"/>
-                <w:szCs w:val="18"/>
-              </w:rPr>
-              <w:t>Groups</w:t>
-            </w:r>
-            <w:proofErr w:type="spellEnd"/>
+              <w:t>VPC, ALB, Security Groups</w:t>
+            </w:r>
           </w:p>
         </w:tc>
         <w:tc>
@@ -740,12 +558,6 @@
         </w:tc>
       </w:tr>
       <w:tr>
-        <w:tblPrEx>
-          <w:tblCellMar>
-            <w:top w:w="0" w:type="dxa"/>
-            <w:bottom w:w="0" w:type="dxa"/>
-          </w:tblCellMar>
-        </w:tblPrEx>
         <w:tc>
           <w:tcPr>
             <w:tcW w:w="1800" w:type="dxa"/>
@@ -791,21 +603,12 @@
             <w:vAlign w:val="center"/>
           </w:tcPr>
           <w:p>
-            <w:proofErr w:type="spellStart"/>
-            <w:r>
-              <w:rPr>
-                <w:sz w:val="18"/>
-                <w:szCs w:val="18"/>
-              </w:rPr>
-              <w:t>CloudWatch</w:t>
-            </w:r>
-            <w:proofErr w:type="spellEnd"/>
-            <w:r>
-              <w:rPr>
-                <w:sz w:val="18"/>
-                <w:szCs w:val="18"/>
-              </w:rPr>
-              <w:t>, SNS, SQS</w:t>
+            <w:r>
+              <w:rPr>
+                <w:sz w:val="18"/>
+                <w:szCs w:val="18"/>
+              </w:rPr>
+              <w:t>CloudWatch, SNS, SQS</w:t>
             </w:r>
           </w:p>
         </w:tc>
@@ -947,12 +750,6 @@
         <w:gridCol w:w="6160"/>
       </w:tblGrid>
       <w:tr>
-        <w:tblPrEx>
-          <w:tblCellMar>
-            <w:top w:w="0" w:type="dxa"/>
-            <w:bottom w:w="0" w:type="dxa"/>
-          </w:tblCellMar>
-        </w:tblPrEx>
         <w:tc>
           <w:tcPr>
             <w:tcW w:w="3200" w:type="dxa"/>
@@ -1017,12 +814,6 @@
         </w:tc>
       </w:tr>
       <w:tr>
-        <w:tblPrEx>
-          <w:tblCellMar>
-            <w:top w:w="0" w:type="dxa"/>
-            <w:bottom w:w="0" w:type="dxa"/>
-          </w:tblCellMar>
-        </w:tblPrEx>
         <w:tc>
           <w:tcPr>
             <w:tcW w:w="3200" w:type="dxa"/>
@@ -1068,32 +859,17 @@
             <w:vAlign w:val="center"/>
           </w:tcPr>
           <w:p>
-            <w:proofErr w:type="spellStart"/>
-            <w:r>
-              <w:rPr>
-                <w:sz w:val="18"/>
-                <w:szCs w:val="18"/>
-              </w:rPr>
-              <w:t>Buckets</w:t>
-            </w:r>
-            <w:proofErr w:type="spellEnd"/>
-            <w:r>
-              <w:rPr>
-                <w:sz w:val="18"/>
-                <w:szCs w:val="18"/>
-              </w:rPr>
-              <w:t xml:space="preserve"> S3 (estándar + archivo) con política de ciclo de vida</w:t>
+            <w:r>
+              <w:rPr>
+                <w:sz w:val="18"/>
+                <w:szCs w:val="18"/>
+              </w:rPr>
+              <w:t>Buckets S3 (estándar + archivo) con política de ciclo de vida</w:t>
             </w:r>
           </w:p>
         </w:tc>
       </w:tr>
       <w:tr>
-        <w:tblPrEx>
-          <w:tblCellMar>
-            <w:top w:w="0" w:type="dxa"/>
-            <w:bottom w:w="0" w:type="dxa"/>
-          </w:tblCellMar>
-        </w:tblPrEx>
         <w:tc>
           <w:tcPr>
             <w:tcW w:w="3200" w:type="dxa"/>
@@ -1146,34 +922,12 @@
                 <w:sz w:val="18"/>
                 <w:szCs w:val="18"/>
               </w:rPr>
-              <w:t xml:space="preserve">Instancia RDS PostgreSQL con </w:t>
-            </w:r>
-            <w:proofErr w:type="spellStart"/>
-            <w:r>
-              <w:rPr>
-                <w:sz w:val="18"/>
-                <w:szCs w:val="18"/>
-              </w:rPr>
-              <w:t>backups</w:t>
-            </w:r>
-            <w:proofErr w:type="spellEnd"/>
-            <w:r>
-              <w:rPr>
-                <w:sz w:val="18"/>
-                <w:szCs w:val="18"/>
-              </w:rPr>
-              <w:t xml:space="preserve"> automáticos</w:t>
+              <w:t>Instancia RDS PostgreSQL con backups automáticos</w:t>
             </w:r>
           </w:p>
         </w:tc>
       </w:tr>
       <w:tr>
-        <w:tblPrEx>
-          <w:tblCellMar>
-            <w:top w:w="0" w:type="dxa"/>
-            <w:bottom w:w="0" w:type="dxa"/>
-          </w:tblCellMar>
-        </w:tblPrEx>
         <w:tc>
           <w:tcPr>
             <w:tcW w:w="3200" w:type="dxa"/>
@@ -1224,34 +978,12 @@
                 <w:sz w:val="18"/>
                 <w:szCs w:val="18"/>
               </w:rPr>
-              <w:t xml:space="preserve">Tabla </w:t>
-            </w:r>
-            <w:proofErr w:type="spellStart"/>
-            <w:r>
-              <w:rPr>
-                <w:sz w:val="18"/>
-                <w:szCs w:val="18"/>
-              </w:rPr>
-              <w:t>DynamoDB</w:t>
-            </w:r>
-            <w:proofErr w:type="spellEnd"/>
-            <w:r>
-              <w:rPr>
-                <w:sz w:val="18"/>
-                <w:szCs w:val="18"/>
-              </w:rPr>
-              <w:t xml:space="preserve"> con índices secundarios</w:t>
+              <w:t>Tabla DynamoDB con índices secundarios</w:t>
             </w:r>
           </w:p>
         </w:tc>
       </w:tr>
       <w:tr>
-        <w:tblPrEx>
-          <w:tblCellMar>
-            <w:top w:w="0" w:type="dxa"/>
-            <w:bottom w:w="0" w:type="dxa"/>
-          </w:tblCellMar>
-        </w:tblPrEx>
         <w:tc>
           <w:tcPr>
             <w:tcW w:w="3200" w:type="dxa"/>
@@ -1304,34 +1036,12 @@
                 <w:sz w:val="18"/>
                 <w:szCs w:val="18"/>
               </w:rPr>
-              <w:t xml:space="preserve">EC2 Auto </w:t>
-            </w:r>
-            <w:proofErr w:type="spellStart"/>
-            <w:r>
-              <w:rPr>
-                <w:sz w:val="18"/>
-                <w:szCs w:val="18"/>
-              </w:rPr>
-              <w:t>Scaling</w:t>
-            </w:r>
-            <w:proofErr w:type="spellEnd"/>
-            <w:r>
-              <w:rPr>
-                <w:sz w:val="18"/>
-                <w:szCs w:val="18"/>
-              </w:rPr>
-              <w:t>, Lambda y ECS desplegados</w:t>
+              <w:t>EC2 Auto Scaling, Lambda y ECS desplegados</w:t>
             </w:r>
           </w:p>
         </w:tc>
       </w:tr>
       <w:tr>
-        <w:tblPrEx>
-          <w:tblCellMar>
-            <w:top w:w="0" w:type="dxa"/>
-            <w:bottom w:w="0" w:type="dxa"/>
-          </w:tblCellMar>
-        </w:tblPrEx>
         <w:tc>
           <w:tcPr>
             <w:tcW w:w="3200" w:type="dxa"/>
@@ -1382,50 +1092,12 @@
                 <w:sz w:val="18"/>
                 <w:szCs w:val="18"/>
               </w:rPr>
-              <w:t xml:space="preserve">VPC, subredes, </w:t>
-            </w:r>
-            <w:proofErr w:type="spellStart"/>
-            <w:r>
-              <w:rPr>
-                <w:sz w:val="18"/>
-                <w:szCs w:val="18"/>
-              </w:rPr>
-              <w:t>security</w:t>
-            </w:r>
-            <w:proofErr w:type="spellEnd"/>
-            <w:r>
-              <w:rPr>
-                <w:sz w:val="18"/>
-                <w:szCs w:val="18"/>
-              </w:rPr>
-              <w:t xml:space="preserve"> </w:t>
-            </w:r>
-            <w:proofErr w:type="spellStart"/>
-            <w:r>
-              <w:rPr>
-                <w:sz w:val="18"/>
-                <w:szCs w:val="18"/>
-              </w:rPr>
-              <w:t>groups</w:t>
-            </w:r>
-            <w:proofErr w:type="spellEnd"/>
-            <w:r>
-              <w:rPr>
-                <w:sz w:val="18"/>
-                <w:szCs w:val="18"/>
-              </w:rPr>
-              <w:t xml:space="preserve"> y ALB</w:t>
+              <w:t>VPC, subredes, security groups y ALB</w:t>
             </w:r>
           </w:p>
         </w:tc>
       </w:tr>
       <w:tr>
-        <w:tblPrEx>
-          <w:tblCellMar>
-            <w:top w:w="0" w:type="dxa"/>
-            <w:bottom w:w="0" w:type="dxa"/>
-          </w:tblCellMar>
-        </w:tblPrEx>
         <w:tc>
           <w:tcPr>
             <w:tcW w:w="3200" w:type="dxa"/>
@@ -1484,12 +1156,6 @@
         </w:tc>
       </w:tr>
       <w:tr>
-        <w:tblPrEx>
-          <w:tblCellMar>
-            <w:top w:w="0" w:type="dxa"/>
-            <w:bottom w:w="0" w:type="dxa"/>
-          </w:tblCellMar>
-        </w:tblPrEx>
         <w:tc>
           <w:tcPr>
             <w:tcW w:w="3200" w:type="dxa"/>
@@ -1540,27 +1206,12 @@
                 <w:sz w:val="18"/>
                 <w:szCs w:val="18"/>
               </w:rPr>
-              <w:t xml:space="preserve">Sitio estático en S3 + </w:t>
-            </w:r>
-            <w:proofErr w:type="spellStart"/>
-            <w:r>
-              <w:rPr>
-                <w:sz w:val="18"/>
-                <w:szCs w:val="18"/>
-              </w:rPr>
-              <w:t>CloudFront</w:t>
-            </w:r>
-            <w:proofErr w:type="spellEnd"/>
+              <w:t>Sitio estático en S3 + CloudFront</w:t>
+            </w:r>
           </w:p>
         </w:tc>
       </w:tr>
       <w:tr>
-        <w:tblPrEx>
-          <w:tblCellMar>
-            <w:top w:w="0" w:type="dxa"/>
-            <w:bottom w:w="0" w:type="dxa"/>
-          </w:tblCellMar>
-        </w:tblPrEx>
         <w:tc>
           <w:tcPr>
             <w:tcW w:w="3200" w:type="dxa"/>
@@ -1613,23 +1264,7 @@
                 <w:sz w:val="18"/>
                 <w:szCs w:val="18"/>
               </w:rPr>
-              <w:t xml:space="preserve">3 métricas, 2 alarmas </w:t>
-            </w:r>
-            <w:proofErr w:type="spellStart"/>
-            <w:r>
-              <w:rPr>
-                <w:sz w:val="18"/>
-                <w:szCs w:val="18"/>
-              </w:rPr>
-              <w:t>CloudWatch</w:t>
-            </w:r>
-            <w:proofErr w:type="spellEnd"/>
-            <w:r>
-              <w:rPr>
-                <w:sz w:val="18"/>
-                <w:szCs w:val="18"/>
-              </w:rPr>
-              <w:t xml:space="preserve"> y acción automática</w:t>
+              <w:t>3 métricas, 2 alarmas CloudWatch y acción automática</w:t>
             </w:r>
           </w:p>
         </w:tc>
@@ -1653,47 +1288,7 @@
         <w:spacing w:after="140" w:line="290" w:lineRule="auto"/>
       </w:pPr>
       <w:r>
-        <w:t xml:space="preserve">El prototipo va más allá de una simulación: usa </w:t>
-      </w:r>
-      <w:proofErr w:type="spellStart"/>
-      <w:r>
-        <w:t>Floci</w:t>
-      </w:r>
-      <w:proofErr w:type="spellEnd"/>
-      <w:r>
-        <w:t xml:space="preserve">, un emulador de AWS de código abierto, para ejecutar llamadas reales de boto3 contra RDS, </w:t>
-      </w:r>
-      <w:proofErr w:type="spellStart"/>
-      <w:r>
-        <w:t>DynamoDB</w:t>
-      </w:r>
-      <w:proofErr w:type="spellEnd"/>
-      <w:r>
-        <w:t xml:space="preserve">, S3, SNS, SQS y </w:t>
-      </w:r>
-      <w:proofErr w:type="spellStart"/>
-      <w:r>
-        <w:t>CloudWatch</w:t>
-      </w:r>
-      <w:proofErr w:type="spellEnd"/>
-      <w:r>
-        <w:t xml:space="preserve">. </w:t>
-      </w:r>
-      <w:proofErr w:type="spellStart"/>
-      <w:r>
-        <w:t>Floci</w:t>
-      </w:r>
-      <w:proofErr w:type="spellEnd"/>
-      <w:r>
-        <w:t xml:space="preserve"> levanta un contenedor real de PostgreSQL para RDS, y toda la aplicación (</w:t>
-      </w:r>
-      <w:proofErr w:type="spellStart"/>
-      <w:r>
-        <w:t>FastAPI</w:t>
-      </w:r>
-      <w:proofErr w:type="spellEnd"/>
-      <w:r>
-        <w:t>) se conecta a los recursos usando exactamente los mismos datos que devuelve la API de AWS, no una configuración fija.</w:t>
+        <w:t>El prototipo va más allá de una simulación: usa Floci, un emulador de AWS de código abierto, para ejecutar llamadas reales de boto3 contra RDS, DynamoDB, S3, SNS, SQS y CloudWatch. Floci levanta un contenedor real de PostgreSQL para RDS, y toda la aplicación (FastAPI) se conecta a los recursos usando exactamente los mismos datos que devuelve la API de AWS, no una configuración fija.</w:t>
       </w:r>
     </w:p>
     <w:p>
@@ -1713,23 +1308,7 @@
         <w:t xml:space="preserve">5 servicios AWS reales aprovisionados: </w:t>
       </w:r>
       <w:r>
-        <w:t xml:space="preserve">RDS, </w:t>
-      </w:r>
-      <w:proofErr w:type="spellStart"/>
-      <w:r>
-        <w:t>DynamoDB</w:t>
-      </w:r>
-      <w:proofErr w:type="spellEnd"/>
-      <w:r>
-        <w:t xml:space="preserve">, S3, SNS/SQS y </w:t>
-      </w:r>
-      <w:proofErr w:type="spellStart"/>
-      <w:r>
-        <w:t>CloudWatch</w:t>
-      </w:r>
-      <w:proofErr w:type="spellEnd"/>
-      <w:r>
-        <w:t>, con datos de prueba y consultas SQL/NoSQL validadas.</w:t>
+        <w:t>RDS, DynamoDB, S3, SNS/SQS y CloudWatch, con datos de prueba y consultas SQL/NoSQL validadas.</w:t>
       </w:r>
     </w:p>
     <w:p>
@@ -1747,34 +1326,10 @@
           <w:bCs/>
         </w:rPr>
         <w:lastRenderedPageBreak/>
-        <w:t xml:space="preserve">13 </w:t>
-      </w:r>
-      <w:proofErr w:type="spellStart"/>
-      <w:r>
-        <w:rPr>
-          <w:b/>
-          <w:bCs/>
-        </w:rPr>
-        <w:t>endpoints</w:t>
-      </w:r>
-      <w:proofErr w:type="spellEnd"/>
-      <w:r>
-        <w:rPr>
-          <w:b/>
-          <w:bCs/>
-        </w:rPr>
-        <w:t xml:space="preserve"> documentados: </w:t>
-      </w:r>
-      <w:r>
-        <w:t>interfaz Swagger interactiva (/</w:t>
-      </w:r>
-      <w:proofErr w:type="spellStart"/>
-      <w:r>
-        <w:t>docs</w:t>
-      </w:r>
-      <w:proofErr w:type="spellEnd"/>
-      <w:r>
-        <w:t>) para probar cada servicio.</w:t>
+        <w:t xml:space="preserve">13 endpoints documentados: </w:t>
+      </w:r>
+      <w:r>
+        <w:t>interfaz Swagger interactiva (/docs) para probar cada servicio.</w:t>
       </w:r>
     </w:p>
     <w:p>
@@ -1791,34 +1346,10 @@
           <w:b/>
           <w:bCs/>
         </w:rPr>
-        <w:t xml:space="preserve">9 pruebas </w:t>
-      </w:r>
-      <w:proofErr w:type="spellStart"/>
-      <w:r>
-        <w:rPr>
-          <w:b/>
-          <w:bCs/>
-        </w:rPr>
-        <w:t>end-to-end</w:t>
-      </w:r>
-      <w:proofErr w:type="spellEnd"/>
-      <w:r>
-        <w:rPr>
-          <w:b/>
-          <w:bCs/>
-        </w:rPr>
-        <w:t xml:space="preserve">: </w:t>
-      </w:r>
-      <w:r>
-        <w:t xml:space="preserve">consultas SQL, consulta NoSQL, listado de </w:t>
-      </w:r>
-      <w:proofErr w:type="spellStart"/>
-      <w:r>
-        <w:t>buckets</w:t>
-      </w:r>
-      <w:proofErr w:type="spellEnd"/>
-      <w:r>
-        <w:t>, publicación y recepción de mensajes, y estado de alarmas, todas verificadas con datos reales.</w:t>
+        <w:t xml:space="preserve">9 pruebas end-to-end: </w:t>
+      </w:r>
+      <w:r>
+        <w:t>consultas SQL, consulta NoSQL, listado de buckets, publicación y recepción de mensajes, y estado de alarmas, todas verificadas con datos reales.</w:t>
       </w:r>
     </w:p>
     <w:p>
@@ -1838,15 +1369,7 @@
         <w:t xml:space="preserve">Transparencia técnica: </w:t>
       </w:r>
       <w:r>
-        <w:t xml:space="preserve">se detectó y documentó que </w:t>
-      </w:r>
-      <w:proofErr w:type="spellStart"/>
-      <w:r>
-        <w:t>Floci</w:t>
-      </w:r>
-      <w:proofErr w:type="spellEnd"/>
-      <w:r>
-        <w:t xml:space="preserve"> no ejecuta un evaluador de alarmas en segundo plano como AWS real; se resolvió con una publicación explícita a SNS al forzar el estado de una alarma, dejando la configuración de las alarmas idéntica a la que se usaría contra AWS real.</w:t>
+        <w:t>se detectó y documentó que Floci no ejecuta un evaluador de alarmas en segundo plano como AWS real; se resolvió con una publicación explícita a SNS al forzar el estado de una alarma, dejando la configuración de las alarmas idéntica a la que se usaría contra AWS real.</w:t>
       </w:r>
     </w:p>
     <w:p>
@@ -1887,12 +1410,6 @@
         <w:gridCol w:w="6160"/>
       </w:tblGrid>
       <w:tr>
-        <w:tblPrEx>
-          <w:tblCellMar>
-            <w:top w:w="0" w:type="dxa"/>
-            <w:bottom w:w="0" w:type="dxa"/>
-          </w:tblCellMar>
-        </w:tblPrEx>
         <w:tc>
           <w:tcPr>
             <w:tcW w:w="3200" w:type="dxa"/>
@@ -1957,12 +1474,6 @@
         </w:tc>
       </w:tr>
       <w:tr>
-        <w:tblPrEx>
-          <w:tblCellMar>
-            <w:top w:w="0" w:type="dxa"/>
-            <w:bottom w:w="0" w:type="dxa"/>
-          </w:tblCellMar>
-        </w:tblPrEx>
         <w:tc>
           <w:tcPr>
             <w:tcW w:w="3200" w:type="dxa"/>
@@ -1981,7 +1492,6 @@
             <w:vAlign w:val="center"/>
           </w:tcPr>
           <w:p>
-            <w:proofErr w:type="spellStart"/>
             <w:r>
               <w:rPr>
                 <w:sz w:val="18"/>
@@ -1989,7 +1499,6 @@
               </w:rPr>
               <w:t>CPUUtilization</w:t>
             </w:r>
-            <w:proofErr w:type="spellEnd"/>
           </w:p>
         </w:tc>
         <w:tc>
@@ -2015,34 +1524,12 @@
                 <w:sz w:val="18"/>
                 <w:szCs w:val="18"/>
               </w:rPr>
-              <w:t>Uso de CPU de la instancia de cómputo (</w:t>
-            </w:r>
-            <w:proofErr w:type="spellStart"/>
-            <w:r>
-              <w:rPr>
-                <w:sz w:val="18"/>
-                <w:szCs w:val="18"/>
-              </w:rPr>
-              <w:t>Percent</w:t>
-            </w:r>
-            <w:proofErr w:type="spellEnd"/>
-            <w:r>
-              <w:rPr>
-                <w:sz w:val="18"/>
-                <w:szCs w:val="18"/>
-              </w:rPr>
-              <w:t>)</w:t>
+              <w:t>Uso de CPU de la instancia de cómputo (Percent)</w:t>
             </w:r>
           </w:p>
         </w:tc>
       </w:tr>
       <w:tr>
-        <w:tblPrEx>
-          <w:tblCellMar>
-            <w:top w:w="0" w:type="dxa"/>
-            <w:bottom w:w="0" w:type="dxa"/>
-          </w:tblCellMar>
-        </w:tblPrEx>
         <w:tc>
           <w:tcPr>
             <w:tcW w:w="3200" w:type="dxa"/>
@@ -2062,7 +1549,6 @@
             <w:vAlign w:val="center"/>
           </w:tcPr>
           <w:p>
-            <w:proofErr w:type="spellStart"/>
             <w:r>
               <w:rPr>
                 <w:sz w:val="18"/>
@@ -2070,7 +1556,6 @@
               </w:rPr>
               <w:t>NetworkIn</w:t>
             </w:r>
-            <w:proofErr w:type="spellEnd"/>
           </w:p>
         </w:tc>
         <w:tc>
@@ -2103,12 +1588,6 @@
         </w:tc>
       </w:tr>
       <w:tr>
-        <w:tblPrEx>
-          <w:tblCellMar>
-            <w:top w:w="0" w:type="dxa"/>
-            <w:bottom w:w="0" w:type="dxa"/>
-          </w:tblCellMar>
-        </w:tblPrEx>
         <w:tc>
           <w:tcPr>
             <w:tcW w:w="3200" w:type="dxa"/>
@@ -2127,7 +1606,6 @@
             <w:vAlign w:val="center"/>
           </w:tcPr>
           <w:p>
-            <w:proofErr w:type="spellStart"/>
             <w:r>
               <w:rPr>
                 <w:sz w:val="18"/>
@@ -2135,7 +1613,6 @@
               </w:rPr>
               <w:t>ErrorCount</w:t>
             </w:r>
-            <w:proofErr w:type="spellEnd"/>
           </w:p>
         </w:tc>
         <w:tc>
@@ -2167,12 +1644,6 @@
         </w:tc>
       </w:tr>
       <w:tr>
-        <w:tblPrEx>
-          <w:tblCellMar>
-            <w:top w:w="0" w:type="dxa"/>
-            <w:bottom w:w="0" w:type="dxa"/>
-          </w:tblCellMar>
-        </w:tblPrEx>
         <w:tc>
           <w:tcPr>
             <w:tcW w:w="3200" w:type="dxa"/>
@@ -2192,7 +1663,6 @@
             <w:vAlign w:val="center"/>
           </w:tcPr>
           <w:p>
-            <w:proofErr w:type="spellStart"/>
             <w:r>
               <w:rPr>
                 <w:sz w:val="18"/>
@@ -2200,7 +1670,6 @@
               </w:rPr>
               <w:t>InfraestructuraViva-CPUAlta</w:t>
             </w:r>
-            <w:proofErr w:type="spellEnd"/>
           </w:p>
         </w:tc>
         <w:tc>
@@ -2233,12 +1702,6 @@
         </w:tc>
       </w:tr>
       <w:tr>
-        <w:tblPrEx>
-          <w:tblCellMar>
-            <w:top w:w="0" w:type="dxa"/>
-            <w:bottom w:w="0" w:type="dxa"/>
-          </w:tblCellMar>
-        </w:tblPrEx>
         <w:tc>
           <w:tcPr>
             <w:tcW w:w="3200" w:type="dxa"/>
@@ -2257,7 +1720,6 @@
             <w:vAlign w:val="center"/>
           </w:tcPr>
           <w:p>
-            <w:proofErr w:type="spellStart"/>
             <w:r>
               <w:rPr>
                 <w:sz w:val="18"/>
@@ -2265,7 +1727,6 @@
               </w:rPr>
               <w:t>InfraestructuraViva-ErroresApp</w:t>
             </w:r>
-            <w:proofErr w:type="spellEnd"/>
           </w:p>
         </w:tc>
         <w:tc>
@@ -2307,15 +1768,7 @@
         <w:spacing w:after="140" w:line="290" w:lineRule="auto"/>
       </w:pPr>
       <w:r>
-        <w:t xml:space="preserve">Ante una alarma en estado ALARM, se documenta como acción automática el incremento de la capacidad del Auto </w:t>
-      </w:r>
-      <w:proofErr w:type="spellStart"/>
-      <w:r>
-        <w:t>Scaling</w:t>
-      </w:r>
-      <w:proofErr w:type="spellEnd"/>
-      <w:r>
-        <w:t xml:space="preserve"> Group de EC2, y el equipo de soporte recibe la notificación vía SNS/SQS para confirmar y ejecutar el protocolo de remediación.</w:t>
+        <w:t>Ante una alarma en estado ALARM, se documenta como acción automática el incremento de la capacidad del Auto Scaling Group de EC2, y el equipo de soporte recibe la notificación vía SNS/SQS para confirmar y ejecutar el protocolo de remediación.</w:t>
       </w:r>
     </w:p>
     <w:p>
@@ -2343,15 +1796,7 @@
         <w:t xml:space="preserve">Seguridad: </w:t>
       </w:r>
       <w:r>
-        <w:t xml:space="preserve">roles IAM de menor privilegio, cifrado en tránsito y en reposo, segmentación de red por capas, alta disponibilidad en 2 zonas y </w:t>
-      </w:r>
-      <w:proofErr w:type="spellStart"/>
-      <w:r>
-        <w:t>backups</w:t>
-      </w:r>
-      <w:proofErr w:type="spellEnd"/>
-      <w:r>
-        <w:t xml:space="preserve"> automáticos.</w:t>
+        <w:t>roles IAM de menor privilegio, cifrado en tránsito y en reposo, segmentación de red por capas, alta disponibilidad en 2 zonas y backups automáticos.</w:t>
       </w:r>
     </w:p>
     <w:p>
@@ -2371,31 +1816,7 @@
         <w:t xml:space="preserve">Costos: </w:t>
       </w:r>
       <w:r>
-        <w:t xml:space="preserve">toda la arquitectura opera dentro del AWS Free Tier durante los primeros 12 meses (EC2, RDS, S3, </w:t>
-      </w:r>
-      <w:proofErr w:type="spellStart"/>
-      <w:r>
-        <w:t>CloudFront</w:t>
-      </w:r>
-      <w:proofErr w:type="spellEnd"/>
-      <w:r>
-        <w:t xml:space="preserve">) y con recursos sin fecha de expiración (Lambda, </w:t>
-      </w:r>
-      <w:proofErr w:type="spellStart"/>
-      <w:r>
-        <w:t>DynamoDB</w:t>
-      </w:r>
-      <w:proofErr w:type="spellEnd"/>
-      <w:r>
-        <w:t xml:space="preserve">, </w:t>
-      </w:r>
-      <w:proofErr w:type="spellStart"/>
-      <w:r>
-        <w:t>CloudWatch</w:t>
-      </w:r>
-      <w:proofErr w:type="spellEnd"/>
-      <w:r>
-        <w:t>).</w:t>
+        <w:t>toda la arquitectura opera dentro del AWS Free Tier durante los primeros 12 meses (EC2, RDS, S3, CloudFront) y con recursos sin fecha de expiración (Lambda, DynamoDB, CloudWatch).</w:t>
       </w:r>
     </w:p>
     <w:p>
@@ -2418,35 +1839,24 @@
           <w:rPr>
             <w:rStyle w:val="Hipervnculo"/>
           </w:rPr>
-          <w:t>github.com/</w:t>
-        </w:r>
-        <w:proofErr w:type="spellStart"/>
-        <w:r>
-          <w:rPr>
-            <w:rStyle w:val="Hipervnculo"/>
-          </w:rPr>
-          <w:t>Martliz</w:t>
-        </w:r>
-        <w:proofErr w:type="spellEnd"/>
-        <w:r>
-          <w:rPr>
-            <w:rStyle w:val="Hipervnculo"/>
-          </w:rPr>
-          <w:t>/infraestructura-vi</w:t>
-        </w:r>
-        <w:r>
-          <w:rPr>
-            <w:rStyle w:val="Hipervnculo"/>
-          </w:rPr>
-          <w:t>v</w:t>
-        </w:r>
-        <w:r>
-          <w:rPr>
-            <w:rStyle w:val="Hipervnculo"/>
-          </w:rPr>
-          <w:t>a</w:t>
+          <w:t>https://github.com/Martliz/infraestructura-viva.git</w:t>
         </w:r>
       </w:hyperlink>
+    </w:p>
+    <w:p>
+      <w:pPr>
+        <w:spacing w:after="120" w:line="280" w:lineRule="auto"/>
+      </w:pPr>
+      <w:r>
+        <w:rPr>
+          <w:b/>
+          <w:bCs/>
+        </w:rPr>
+        <w:t xml:space="preserve">Documento de arquitectura: </w:t>
+      </w:r>
+      <w:r>
+        <w:t>descripción detallada, justificación de cada servicio y diagrama completo.</w:t>
+      </w:r>
     </w:p>
     <w:p>
       <w:pPr>
@@ -2462,10 +1872,10 @@
           <w:b/>
           <w:bCs/>
         </w:rPr>
-        <w:t xml:space="preserve">Documento de arquitectura: </w:t>
-      </w:r>
-      <w:r>
-        <w:t>descripción detallada, justificación de cada servicio y diagrama completo.</w:t>
+        <w:t xml:space="preserve">Prototipo o demo: </w:t>
+      </w:r>
+      <w:r>
+        <w:t>instrucciones de despliegue, configuración en VS Code y demostración de consultas.</w:t>
       </w:r>
     </w:p>
     <w:p>
@@ -2482,10 +1892,10 @@
           <w:b/>
           <w:bCs/>
         </w:rPr>
-        <w:t xml:space="preserve">Prototipo o demo: </w:t>
-      </w:r>
-      <w:r>
-        <w:t>instrucciones de despliegue, configuración en VS Code y demostración de consultas.</w:t>
+        <w:t xml:space="preserve">Plan de monitoreo y notificaciones: </w:t>
+      </w:r>
+      <w:r>
+        <w:t>métricas, alarmas, acción automática y nota técnica de transparencia sobre Floci.</w:t>
       </w:r>
     </w:p>
     <w:p>
@@ -2502,34 +1912,6 @@
           <w:b/>
           <w:bCs/>
         </w:rPr>
-        <w:t xml:space="preserve">Plan de monitoreo y notificaciones: </w:t>
-      </w:r>
-      <w:r>
-        <w:t xml:space="preserve">métricas, alarmas, acción automática y nota técnica de transparencia sobre </w:t>
-      </w:r>
-      <w:proofErr w:type="spellStart"/>
-      <w:r>
-        <w:t>Floci</w:t>
-      </w:r>
-      <w:proofErr w:type="spellEnd"/>
-      <w:r>
-        <w:t>.</w:t>
-      </w:r>
-    </w:p>
-    <w:p>
-      <w:pPr>
-        <w:pStyle w:val="Prrafodelista"/>
-        <w:numPr>
-          <w:ilvl w:val="0"/>
-          <w:numId w:val="2"/>
-        </w:numPr>
-        <w:spacing w:after="100" w:line="270" w:lineRule="auto"/>
-      </w:pPr>
-      <w:r>
-        <w:rPr>
-          <w:b/>
-          <w:bCs/>
-        </w:rPr>
         <w:t xml:space="preserve">Guía de buenas prácticas: </w:t>
       </w:r>
       <w:r>
@@ -2553,23 +1935,7 @@
           <w:i/>
           <w:iCs/>
         </w:rPr>
-        <w:t xml:space="preserve">Integrar en un solo diseño los conceptos desarrollados por separado en cada manual del módulo, y aprender a distinguir un problema de diseño de arquitectura de una limitación de la herramienta usada para probarlo localmente, fue el </w:t>
-      </w:r>
-      <w:proofErr w:type="gramStart"/>
-      <w:r>
-        <w:rPr>
-          <w:i/>
-          <w:iCs/>
-        </w:rPr>
-        <w:t>mayor desafío y el mayor aprendizaje</w:t>
-      </w:r>
-      <w:proofErr w:type="gramEnd"/>
-      <w:r>
-        <w:rPr>
-          <w:i/>
-          <w:iCs/>
-        </w:rPr>
-        <w:t xml:space="preserve"> de este proyecto. Documentar ese hallazgo con la </w:t>
+        <w:t xml:space="preserve">Integrar en un solo diseño los conceptos desarrollados por separado en cada manual del módulo, y aprender a distinguir un problema de diseño de arquitectura de una limitación de la herramienta usada para probarlo localmente, fue el mayor desafío y el mayor aprendizaje de este proyecto. Documentar ese hallazgo con la </w:t>
       </w:r>
       <w:r>
         <w:rPr>
@@ -2577,23 +1943,7 @@
           <w:iCs/>
         </w:rPr>
         <w:lastRenderedPageBreak/>
-        <w:t xml:space="preserve">misma honestidad con la que se documenta lo que sí funcionó es, en mi opinión, parte del criterio que se espera de un arquitecto </w:t>
-      </w:r>
-      <w:proofErr w:type="spellStart"/>
-      <w:r>
-        <w:rPr>
-          <w:i/>
-          <w:iCs/>
-        </w:rPr>
-        <w:t>cloud</w:t>
-      </w:r>
-      <w:proofErr w:type="spellEnd"/>
-      <w:r>
-        <w:rPr>
-          <w:i/>
-          <w:iCs/>
-        </w:rPr>
-        <w:t>.</w:t>
+        <w:t>misma honestidad con la que se documenta lo que sí funcionó es, en mi opinión, parte del criterio que se espera de un arquitecto cloud.</w:t>
       </w:r>
     </w:p>
     <w:sectPr>
@@ -3552,6 +2902,18 @@
       <w:u w:val="single"/>
     </w:rPr>
   </w:style>
+  <w:style w:type="character" w:styleId="Mencinsinresolver">
+    <w:name w:val="Unresolved Mention"/>
+    <w:basedOn w:val="Fuentedeprrafopredeter"/>
+    <w:uiPriority w:val="99"/>
+    <w:semiHidden/>
+    <w:unhideWhenUsed/>
+    <w:rsid w:val="00500022"/>
+    <w:rPr>
+      <w:color w:val="605E5C"/>
+      <w:shd w:val="clear" w:color="auto" w:fill="E1DFDD"/>
+    </w:rPr>
+  </w:style>
 </w:styles>
 </file>
 

</xml_diff>